<commit_message>
ADDING TODAY'S WORK - 18.06.2026
</commit_message>
<xml_diff>
--- a/write_up/drafts/3_materials_and_methods/methods_plan.docx
+++ b/write_up/drafts/3_materials_and_methods/methods_plan.docx
@@ -1,8 +1,39 @@
 
 <file path=word/document.xml><?xml version="1.0" encoding="utf-8"?>
-<w:document xmlns:wpc="http://schemas.microsoft.com/office/word/2010/wordprocessingCanvas" xmlns:cx="http://schemas.microsoft.com/office/drawing/2014/chartex" xmlns:cx1="http://schemas.microsoft.com/office/drawing/2015/9/8/chartex" xmlns:cx2="http://schemas.microsoft.com/office/drawing/2015/10/21/chartex" xmlns:cx3="http://schemas.microsoft.com/office/drawing/2016/5/9/chartex" xmlns:cx4="http://schemas.microsoft.com/office/drawing/2016/5/10/chartex" xmlns:cx5="http://schemas.microsoft.com/office/drawing/2016/5/11/chartex" xmlns:cx6="http://schemas.microsoft.com/office/drawing/2016/5/12/chartex" xmlns:cx7="http://schemas.microsoft.com/office/drawing/2016/5/13/chartex" xmlns:cx8="http://schemas.microsoft.com/office/drawing/2016/5/14/chartex" xmlns:mc="http://schemas.openxmlformats.org/markup-compatibility/2006" xmlns:aink="http://schemas.microsoft.com/office/drawing/2016/ink" xmlns:am3d="http://schemas.microsoft.com/office/drawing/2017/model3d" xmlns:o="urn:schemas-microsoft-com:office:office" xmlns:oel="http://schemas.microsoft.com/office/2019/extlst" xmlns:r="http://schemas.openxmlformats.org/officeDocument/2006/relationships" xmlns:m="http://schemas.openxmlformats.org/officeDocument/2006/math" xmlns:v="urn:schemas-microsoft-com:vml" xmlns:wp14="http://schemas.microsoft.com/office/word/2010/wordprocessingDrawing" xmlns:wp="http://schemas.openxmlformats.org/drawingml/2006/wordprocessingDrawing" xmlns:w10="urn:schemas-microsoft-com:office:word" xmlns:w="http://schemas.openxmlformats.org/wordprocessingml/2006/main" xmlns:w14="http://schemas.microsoft.com/office/word/2010/wordml" xmlns:w15="http://schemas.microsoft.com/office/word/2012/wordml" xmlns:w16cex="http://schemas.microsoft.com/office/word/2018/wordml/cex" xmlns:w16cid="http://schemas.microsoft.com/office/word/2016/wordml/cid" xmlns:w16="http://schemas.microsoft.com/office/word/2018/wordml" xmlns:w16du="http://schemas.microsoft.com/office/word/2023/wordml/word16du" xmlns:w16sdtdh="http://schemas.microsoft.com/office/word/2020/wordml/sdtdatahash" xmlns:w16sdtfl="http://schemas.microsoft.com/office/word/2024/wordml/sdtformatlock" xmlns:w16se="http://schemas.microsoft.com/office/word/2015/wordml/symex" xmlns:wpg="http://schemas.microsoft.com/office/word/2010/wordprocessingGroup" xmlns:wpi="http://schemas.microsoft.com/office/word/2010/wordprocessingInk" xmlns:wne="http://schemas.microsoft.com/office/word/2006/wordml" xmlns:wps="http://schemas.microsoft.com/office/word/2010/wordprocessingShape" mc:Ignorable="w14 w15 w16se w16cid w16 w16cex w16sdtdh w16sdtfl w16du wp14">
+<w:document xmlns:wpc="http://schemas.microsoft.com/office/word/2010/wordprocessingCanvas" xmlns:cx="http://schemas.microsoft.com/office/drawing/2014/chartex" xmlns:cx1="http://schemas.microsoft.com/office/drawing/2015/9/8/chartex" xmlns:cx2="http://schemas.microsoft.com/office/drawing/2015/10/21/chartex" xmlns:cx3="http://schemas.microsoft.com/office/drawing/2016/5/9/chartex" xmlns:cx4="http://schemas.microsoft.com/office/drawing/2016/5/10/chartex" xmlns:cx5="http://schemas.microsoft.com/office/drawing/2016/5/11/chartex" xmlns:cx6="http://schemas.microsoft.com/office/drawing/2016/5/12/chartex" xmlns:cx7="http://schemas.microsoft.com/office/drawing/2016/5/13/chartex" xmlns:cx8="http://schemas.microsoft.com/office/drawing/2016/5/14/chartex" xmlns:mc="http://schemas.openxmlformats.org/markup-compatibility/2006" xmlns:m="http://schemas.openxmlformats.org/officeDocument/2006/math" xmlns:aink="http://schemas.microsoft.com/office/drawing/2016/ink" xmlns:am3d="http://schemas.microsoft.com/office/drawing/2017/model3d" xmlns:oel="http://schemas.microsoft.com/office/2019/extlst" xmlns:r="http://schemas.openxmlformats.org/officeDocument/2006/relationships" xmlns:wp14="http://schemas.microsoft.com/office/word/2010/wordprocessingDrawing" xmlns:wp="http://schemas.openxmlformats.org/drawingml/2006/wordprocessingDrawing" xmlns:wpg="http://schemas.microsoft.com/office/word/2010/wordprocessingGroup" xmlns:wpi="http://schemas.microsoft.com/office/word/2010/wordprocessingInk" xmlns:wps="http://schemas.microsoft.com/office/word/2010/wordprocessingShape" xmlns:o="urn:schemas-microsoft-com:office:office" xmlns:v="urn:schemas-microsoft-com:vml" xmlns:w10="urn:schemas-microsoft-com:office:word" xmlns:w="http://schemas.openxmlformats.org/wordprocessingml/2006/main" xmlns:w14="http://schemas.microsoft.com/office/word/2010/wordml" xmlns:w15="http://schemas.microsoft.com/office/word/2012/wordml" xmlns:w16cex="http://schemas.microsoft.com/office/word/2018/wordml/cex" xmlns:w16cid="http://schemas.microsoft.com/office/word/2016/wordml/cid" xmlns:w16="http://schemas.microsoft.com/office/word/2018/wordml" xmlns:w16sdtdh="http://schemas.microsoft.com/office/word/2020/wordml/sdtdatahash" xmlns:w16sdtfl="http://schemas.microsoft.com/office/word/2024/wordml/sdtformatlock" xmlns:w16se="http://schemas.microsoft.com/office/word/2015/wordml/symex" xmlns:w16du="http://schemas.microsoft.com/office/word/2023/wordml/word16du" xmlns:wne="http://schemas.microsoft.com/office/word/2006/wordml" mc:Ignorable="w14 w15 w16se w16cid w16 w16cex w16sdtdh w16sdtfl w16du wp14">
   <w:body>
-    <w:p/>
+    <w:p>
+      <w:pPr>
+        <w:pStyle w:val="ListParagraph"/>
+        <w:numPr>
+          <w:ilvl w:val="0"/>
+          <w:numId w:val="2"/>
+        </w:numPr>
+      </w:pPr>
+      <w:r>
+        <w:t>No background universe selected as EVs act on a diverse range of cells therefore this would have limited the scope.</w:t>
+      </w:r>
+    </w:p>
+    <w:p>
+      <w:pPr>
+        <w:pStyle w:val="ListParagraph"/>
+        <w:numPr>
+          <w:ilvl w:val="0"/>
+          <w:numId w:val="2"/>
+        </w:numPr>
+      </w:pPr>
+      <w:r>
+        <w:t xml:space="preserve">Use harmonisation of de </w:t>
+      </w:r>
+      <w:proofErr w:type="spellStart"/>
+      <w:r>
+        <w:t>mirnas</w:t>
+      </w:r>
+      <w:proofErr w:type="spellEnd"/>
+      <w:r>
+        <w:t xml:space="preserve"> from deseq2 and edger?</w:t>
+      </w:r>
+    </w:p>
     <w:sectPr>
       <w:pgSz w:w="11906" w:h="16838"/>
       <w:pgMar w:top="1440" w:right="1440" w:bottom="1440" w:left="1440" w:header="708" w:footer="708" w:gutter="0"/>
@@ -14,8 +45,121 @@
 </file>
 
 <file path=word/numbering.xml><?xml version="1.0" encoding="utf-8"?>
-<w:numbering xmlns:wpc="http://schemas.microsoft.com/office/word/2010/wordprocessingCanvas" xmlns:cx="http://schemas.microsoft.com/office/drawing/2014/chartex" xmlns:cx1="http://schemas.microsoft.com/office/drawing/2015/9/8/chartex" xmlns:cx2="http://schemas.microsoft.com/office/drawing/2015/10/21/chartex" xmlns:cx3="http://schemas.microsoft.com/office/drawing/2016/5/9/chartex" xmlns:cx4="http://schemas.microsoft.com/office/drawing/2016/5/10/chartex" xmlns:cx5="http://schemas.microsoft.com/office/drawing/2016/5/11/chartex" xmlns:cx6="http://schemas.microsoft.com/office/drawing/2016/5/12/chartex" xmlns:cx7="http://schemas.microsoft.com/office/drawing/2016/5/13/chartex" xmlns:cx8="http://schemas.microsoft.com/office/drawing/2016/5/14/chartex" xmlns:mc="http://schemas.openxmlformats.org/markup-compatibility/2006" xmlns:aink="http://schemas.microsoft.com/office/drawing/2016/ink" xmlns:am3d="http://schemas.microsoft.com/office/drawing/2017/model3d" xmlns:o="urn:schemas-microsoft-com:office:office" xmlns:oel="http://schemas.microsoft.com/office/2019/extlst" xmlns:r="http://schemas.openxmlformats.org/officeDocument/2006/relationships" xmlns:m="http://schemas.openxmlformats.org/officeDocument/2006/math" xmlns:v="urn:schemas-microsoft-com:vml" xmlns:wp14="http://schemas.microsoft.com/office/word/2010/wordprocessingDrawing" xmlns:wp="http://schemas.openxmlformats.org/drawingml/2006/wordprocessingDrawing" xmlns:w10="urn:schemas-microsoft-com:office:word" xmlns:w="http://schemas.openxmlformats.org/wordprocessingml/2006/main" xmlns:w14="http://schemas.microsoft.com/office/word/2010/wordml" xmlns:w15="http://schemas.microsoft.com/office/word/2012/wordml" xmlns:w16cex="http://schemas.microsoft.com/office/word/2018/wordml/cex" xmlns:w16cid="http://schemas.microsoft.com/office/word/2016/wordml/cid" xmlns:w16="http://schemas.microsoft.com/office/word/2018/wordml" xmlns:w16du="http://schemas.microsoft.com/office/word/2023/wordml/word16du" xmlns:w16sdtdh="http://schemas.microsoft.com/office/word/2020/wordml/sdtdatahash" xmlns:w16sdtfl="http://schemas.microsoft.com/office/word/2024/wordml/sdtformatlock" xmlns:w16se="http://schemas.microsoft.com/office/word/2015/wordml/symex" xmlns:wpg="http://schemas.microsoft.com/office/word/2010/wordprocessingGroup" xmlns:wpi="http://schemas.microsoft.com/office/word/2010/wordprocessingInk" xmlns:wne="http://schemas.microsoft.com/office/word/2006/wordml" xmlns:wps="http://schemas.microsoft.com/office/word/2010/wordprocessingShape" mc:Ignorable="w14 w15 w16se w16cid w16 w16cex w16sdtdh w16sdtfl w16du wp14">
+<w:numbering xmlns:wpc="http://schemas.microsoft.com/office/word/2010/wordprocessingCanvas" xmlns:cx="http://schemas.microsoft.com/office/drawing/2014/chartex" xmlns:cx1="http://schemas.microsoft.com/office/drawing/2015/9/8/chartex" xmlns:cx2="http://schemas.microsoft.com/office/drawing/2015/10/21/chartex" xmlns:cx3="http://schemas.microsoft.com/office/drawing/2016/5/9/chartex" xmlns:cx4="http://schemas.microsoft.com/office/drawing/2016/5/10/chartex" xmlns:cx5="http://schemas.microsoft.com/office/drawing/2016/5/11/chartex" xmlns:cx6="http://schemas.microsoft.com/office/drawing/2016/5/12/chartex" xmlns:cx7="http://schemas.microsoft.com/office/drawing/2016/5/13/chartex" xmlns:cx8="http://schemas.microsoft.com/office/drawing/2016/5/14/chartex" xmlns:mc="http://schemas.openxmlformats.org/markup-compatibility/2006" xmlns:m="http://schemas.openxmlformats.org/officeDocument/2006/math" xmlns:aink="http://schemas.microsoft.com/office/drawing/2016/ink" xmlns:am3d="http://schemas.microsoft.com/office/drawing/2017/model3d" xmlns:oel="http://schemas.microsoft.com/office/2019/extlst" xmlns:r="http://schemas.openxmlformats.org/officeDocument/2006/relationships" xmlns:wp14="http://schemas.microsoft.com/office/word/2010/wordprocessingDrawing" xmlns:wp="http://schemas.openxmlformats.org/drawingml/2006/wordprocessingDrawing" xmlns:wpg="http://schemas.microsoft.com/office/word/2010/wordprocessingGroup" xmlns:wpi="http://schemas.microsoft.com/office/word/2010/wordprocessingInk" xmlns:wps="http://schemas.microsoft.com/office/word/2010/wordprocessingShape" xmlns:o="urn:schemas-microsoft-com:office:office" xmlns:v="urn:schemas-microsoft-com:vml" xmlns:w10="urn:schemas-microsoft-com:office:word" xmlns:w="http://schemas.openxmlformats.org/wordprocessingml/2006/main" xmlns:w14="http://schemas.microsoft.com/office/word/2010/wordml" xmlns:w15="http://schemas.microsoft.com/office/word/2012/wordml" xmlns:w16cex="http://schemas.microsoft.com/office/word/2018/wordml/cex" xmlns:w16cid="http://schemas.microsoft.com/office/word/2016/wordml/cid" xmlns:w16="http://schemas.microsoft.com/office/word/2018/wordml" xmlns:w16sdtdh="http://schemas.microsoft.com/office/word/2020/wordml/sdtdatahash" xmlns:w16sdtfl="http://schemas.microsoft.com/office/word/2024/wordml/sdtformatlock" xmlns:w16se="http://schemas.microsoft.com/office/word/2015/wordml/symex" xmlns:w16du="http://schemas.microsoft.com/office/word/2023/wordml/word16du" xmlns:wne="http://schemas.microsoft.com/office/word/2006/wordml" mc:Ignorable="w14 w15 w16se w16cid w16 w16cex w16sdtdh w16sdtfl w16du wp14">
   <w:abstractNum w:abstractNumId="0" w15:restartNumberingAfterBreak="0">
+    <w:nsid w:val="5DDB6516"/>
+    <w:multiLevelType w:val="hybridMultilevel"/>
+    <w:tmpl w:val="9642E9F4"/>
+    <w:lvl w:ilvl="0" w:tplc="08090001">
+      <w:start w:val="1"/>
+      <w:numFmt w:val="bullet"/>
+      <w:lvlText w:val=""/>
+      <w:lvlJc w:val="left"/>
+      <w:pPr>
+        <w:ind w:left="720" w:hanging="360"/>
+      </w:pPr>
+      <w:rPr>
+        <w:rFonts w:ascii="Symbol" w:hAnsi="Symbol" w:hint="default"/>
+      </w:rPr>
+    </w:lvl>
+    <w:lvl w:ilvl="1" w:tplc="08090003" w:tentative="1">
+      <w:start w:val="1"/>
+      <w:numFmt w:val="bullet"/>
+      <w:lvlText w:val="o"/>
+      <w:lvlJc w:val="left"/>
+      <w:pPr>
+        <w:ind w:left="1440" w:hanging="360"/>
+      </w:pPr>
+      <w:rPr>
+        <w:rFonts w:ascii="Courier New" w:hAnsi="Courier New" w:cs="Courier New" w:hint="default"/>
+      </w:rPr>
+    </w:lvl>
+    <w:lvl w:ilvl="2" w:tplc="08090005" w:tentative="1">
+      <w:start w:val="1"/>
+      <w:numFmt w:val="bullet"/>
+      <w:lvlText w:val=""/>
+      <w:lvlJc w:val="left"/>
+      <w:pPr>
+        <w:ind w:left="2160" w:hanging="360"/>
+      </w:pPr>
+      <w:rPr>
+        <w:rFonts w:ascii="Wingdings" w:hAnsi="Wingdings" w:hint="default"/>
+      </w:rPr>
+    </w:lvl>
+    <w:lvl w:ilvl="3" w:tplc="08090001" w:tentative="1">
+      <w:start w:val="1"/>
+      <w:numFmt w:val="bullet"/>
+      <w:lvlText w:val=""/>
+      <w:lvlJc w:val="left"/>
+      <w:pPr>
+        <w:ind w:left="2880" w:hanging="360"/>
+      </w:pPr>
+      <w:rPr>
+        <w:rFonts w:ascii="Symbol" w:hAnsi="Symbol" w:hint="default"/>
+      </w:rPr>
+    </w:lvl>
+    <w:lvl w:ilvl="4" w:tplc="08090003" w:tentative="1">
+      <w:start w:val="1"/>
+      <w:numFmt w:val="bullet"/>
+      <w:lvlText w:val="o"/>
+      <w:lvlJc w:val="left"/>
+      <w:pPr>
+        <w:ind w:left="3600" w:hanging="360"/>
+      </w:pPr>
+      <w:rPr>
+        <w:rFonts w:ascii="Courier New" w:hAnsi="Courier New" w:cs="Courier New" w:hint="default"/>
+      </w:rPr>
+    </w:lvl>
+    <w:lvl w:ilvl="5" w:tplc="08090005" w:tentative="1">
+      <w:start w:val="1"/>
+      <w:numFmt w:val="bullet"/>
+      <w:lvlText w:val=""/>
+      <w:lvlJc w:val="left"/>
+      <w:pPr>
+        <w:ind w:left="4320" w:hanging="360"/>
+      </w:pPr>
+      <w:rPr>
+        <w:rFonts w:ascii="Wingdings" w:hAnsi="Wingdings" w:hint="default"/>
+      </w:rPr>
+    </w:lvl>
+    <w:lvl w:ilvl="6" w:tplc="08090001" w:tentative="1">
+      <w:start w:val="1"/>
+      <w:numFmt w:val="bullet"/>
+      <w:lvlText w:val=""/>
+      <w:lvlJc w:val="left"/>
+      <w:pPr>
+        <w:ind w:left="5040" w:hanging="360"/>
+      </w:pPr>
+      <w:rPr>
+        <w:rFonts w:ascii="Symbol" w:hAnsi="Symbol" w:hint="default"/>
+      </w:rPr>
+    </w:lvl>
+    <w:lvl w:ilvl="7" w:tplc="08090003" w:tentative="1">
+      <w:start w:val="1"/>
+      <w:numFmt w:val="bullet"/>
+      <w:lvlText w:val="o"/>
+      <w:lvlJc w:val="left"/>
+      <w:pPr>
+        <w:ind w:left="5760" w:hanging="360"/>
+      </w:pPr>
+      <w:rPr>
+        <w:rFonts w:ascii="Courier New" w:hAnsi="Courier New" w:cs="Courier New" w:hint="default"/>
+      </w:rPr>
+    </w:lvl>
+    <w:lvl w:ilvl="8" w:tplc="08090005" w:tentative="1">
+      <w:start w:val="1"/>
+      <w:numFmt w:val="bullet"/>
+      <w:lvlText w:val=""/>
+      <w:lvlJc w:val="left"/>
+      <w:pPr>
+        <w:ind w:left="6480" w:hanging="360"/>
+      </w:pPr>
+      <w:rPr>
+        <w:rFonts w:ascii="Wingdings" w:hAnsi="Wingdings" w:hint="default"/>
+      </w:rPr>
+    </w:lvl>
+  </w:abstractNum>
+  <w:abstractNum w:abstractNumId="1" w15:restartNumberingAfterBreak="0">
     <w:nsid w:val="746A5C0A"/>
     <w:multiLevelType w:val="hybridMultilevel"/>
     <w:tmpl w:val="50DEA51A"/>
@@ -129,13 +273,16 @@
     </w:lvl>
   </w:abstractNum>
   <w:num w:numId="1" w16cid:durableId="853226515">
+    <w:abstractNumId w:val="1"/>
+  </w:num>
+  <w:num w:numId="2" w16cid:durableId="1337922806">
     <w:abstractNumId w:val="0"/>
   </w:num>
 </w:numbering>
 </file>
 
 <file path=word/styles.xml><?xml version="1.0" encoding="utf-8"?>
-<w:styles xmlns:mc="http://schemas.openxmlformats.org/markup-compatibility/2006" xmlns:r="http://schemas.openxmlformats.org/officeDocument/2006/relationships" xmlns:w="http://schemas.openxmlformats.org/wordprocessingml/2006/main" xmlns:w14="http://schemas.microsoft.com/office/word/2010/wordml" xmlns:w15="http://schemas.microsoft.com/office/word/2012/wordml" xmlns:w16cex="http://schemas.microsoft.com/office/word/2018/wordml/cex" xmlns:w16cid="http://schemas.microsoft.com/office/word/2016/wordml/cid" xmlns:w16="http://schemas.microsoft.com/office/word/2018/wordml" xmlns:w16du="http://schemas.microsoft.com/office/word/2023/wordml/word16du" xmlns:w16sdtdh="http://schemas.microsoft.com/office/word/2020/wordml/sdtdatahash" xmlns:w16sdtfl="http://schemas.microsoft.com/office/word/2024/wordml/sdtformatlock" xmlns:w16se="http://schemas.microsoft.com/office/word/2015/wordml/symex" mc:Ignorable="w14 w15 w16se w16cid w16 w16cex w16sdtdh w16sdtfl w16du">
+<w:styles xmlns:mc="http://schemas.openxmlformats.org/markup-compatibility/2006" xmlns:r="http://schemas.openxmlformats.org/officeDocument/2006/relationships" xmlns:w="http://schemas.openxmlformats.org/wordprocessingml/2006/main" xmlns:w14="http://schemas.microsoft.com/office/word/2010/wordml" xmlns:w15="http://schemas.microsoft.com/office/word/2012/wordml" xmlns:w16cex="http://schemas.microsoft.com/office/word/2018/wordml/cex" xmlns:w16cid="http://schemas.microsoft.com/office/word/2016/wordml/cid" xmlns:w16="http://schemas.microsoft.com/office/word/2018/wordml" xmlns:w16sdtdh="http://schemas.microsoft.com/office/word/2020/wordml/sdtdatahash" xmlns:w16sdtfl="http://schemas.microsoft.com/office/word/2024/wordml/sdtformatlock" xmlns:w16se="http://schemas.microsoft.com/office/word/2015/wordml/symex" xmlns:w16du="http://schemas.microsoft.com/office/word/2023/wordml/word16du" mc:Ignorable="w14 w15 w16se w16cid w16 w16cex w16sdtdh w16sdtfl w16du">
   <w:docDefaults>
     <w:rPrDefault>
       <w:rPr>

</xml_diff>

<commit_message>
ADDING TODAY'S WORK - 26.06.2026
</commit_message>
<xml_diff>
--- a/write_up/drafts/3_materials_and_methods/methods_plan.docx
+++ b/write_up/drafts/3_materials_and_methods/methods_plan.docx
@@ -55,6 +55,17 @@
           <w:numId w:val="2"/>
         </w:numPr>
       </w:pPr>
+      <w:r>
+        <w:t xml:space="preserve">Put the template bash script in the </w:t>
+      </w:r>
+      <w:proofErr w:type="spellStart"/>
+      <w:r>
+        <w:t>github</w:t>
+      </w:r>
+      <w:proofErr w:type="spellEnd"/>
+      <w:r>
+        <w:t xml:space="preserve"> repo and say that this was built to standardise my scripts and make it easier to quickly build new scripts – all bash scripts were derived from this template</w:t>
+      </w:r>
     </w:p>
     <w:p>
       <w:r>
@@ -82,13 +93,7 @@
         </w:numPr>
       </w:pPr>
       <w:r>
-        <w:t xml:space="preserve">Methods </w:t>
-      </w:r>
-      <w:r>
-        <w:t xml:space="preserve">tested </w:t>
-      </w:r>
-      <w:r>
-        <w:t>to perform FE analysis: indirect vs direct vs canonical pathways</w:t>
+        <w:t>Methods tested to perform FE analysis: indirect vs direct vs canonical pathways</w:t>
       </w:r>
     </w:p>
     <w:p/>
@@ -98,6 +103,16 @@
           <w:b/>
           <w:bCs/>
         </w:rPr>
+        <w:t>Methods</w:t>
+      </w:r>
+    </w:p>
+    <w:p/>
+    <w:p>
+      <w:r>
+        <w:rPr>
+          <w:b/>
+          <w:bCs/>
+        </w:rPr>
         <w:t>S</w:t>
       </w:r>
       <w:r>
@@ -125,7 +140,7 @@
           <w:sz w:val="28"/>
           <w:szCs w:val="28"/>
         </w:rPr>
-        <w:t>Raw data and references</w:t>
+        <w:t>Raw data</w:t>
       </w:r>
     </w:p>
     <w:p>
@@ -197,55 +212,134 @@
     <w:p>
       <w:pPr>
         <w:rPr>
-          <w:b/>
-          <w:bCs/>
-        </w:rPr>
-      </w:pPr>
-      <w:r>
-        <w:rPr>
-          <w:b/>
-          <w:bCs/>
-        </w:rPr>
-        <w:t>References</w:t>
-      </w:r>
-    </w:p>
-    <w:p>
-      <w:pPr>
-        <w:pStyle w:val="ListParagraph"/>
-        <w:numPr>
-          <w:ilvl w:val="0"/>
-          <w:numId w:val="2"/>
-        </w:numPr>
-        <w:rPr>
-          <w:sz w:val="28"/>
-          <w:szCs w:val="28"/>
-        </w:rPr>
-      </w:pPr>
-      <w:r>
-        <w:t>Mature miRNAs</w:t>
-      </w:r>
-      <w:r>
-        <w:t xml:space="preserve"> miRbase 22.1</w:t>
-      </w:r>
-    </w:p>
-    <w:p>
-      <w:pPr>
-        <w:pStyle w:val="ListParagraph"/>
-        <w:numPr>
-          <w:ilvl w:val="0"/>
-          <w:numId w:val="2"/>
-        </w:numPr>
-        <w:rPr>
-          <w:sz w:val="28"/>
-          <w:szCs w:val="28"/>
-        </w:rPr>
-      </w:pPr>
-      <w:r>
-        <w:t>Hairpin miRNAs</w:t>
-      </w:r>
-      <w:r>
-        <w:t xml:space="preserve"> miRbase 22.1</w:t>
-      </w:r>
+          <w:sz w:val="28"/>
+          <w:szCs w:val="28"/>
+        </w:rPr>
+      </w:pPr>
+    </w:p>
+    <w:p>
+      <w:pPr>
+        <w:rPr>
+          <w:b/>
+          <w:bCs/>
+          <w:sz w:val="28"/>
+          <w:szCs w:val="28"/>
+        </w:rPr>
+      </w:pPr>
+      <w:r>
+        <w:rPr>
+          <w:b/>
+          <w:bCs/>
+          <w:sz w:val="28"/>
+          <w:szCs w:val="28"/>
+        </w:rPr>
+        <w:t>Text Body</w:t>
+      </w:r>
+    </w:p>
+    <w:p>
+      <w:pPr>
+        <w:rPr>
+          <w:sz w:val="28"/>
+          <w:szCs w:val="28"/>
+        </w:rPr>
+      </w:pPr>
+    </w:p>
+    <w:p>
+      <w:pPr>
+        <w:rPr>
+          <w:sz w:val="28"/>
+          <w:szCs w:val="28"/>
+        </w:rPr>
+      </w:pPr>
+      <w:r>
+        <w:rPr>
+          <w:sz w:val="28"/>
+          <w:szCs w:val="28"/>
+        </w:rPr>
+        <w:t xml:space="preserve">EVs were extracted </w:t>
+      </w:r>
+      <w:r>
+        <w:rPr>
+          <w:sz w:val="28"/>
+          <w:szCs w:val="28"/>
+        </w:rPr>
+        <w:t xml:space="preserve">and isolated </w:t>
+      </w:r>
+      <w:r>
+        <w:rPr>
+          <w:sz w:val="28"/>
+          <w:szCs w:val="28"/>
+        </w:rPr>
+        <w:t xml:space="preserve">from primary or Calu-3 HBECs and exposed to nebulised protease </w:t>
+      </w:r>
+      <w:r>
+        <w:rPr>
+          <w:sz w:val="28"/>
+          <w:szCs w:val="28"/>
+        </w:rPr>
+        <w:t>or HDM and dog allergens, respectively, as described in [GH</w:t>
+      </w:r>
+      <w:r>
+        <w:rPr>
+          <w:sz w:val="28"/>
+          <w:szCs w:val="28"/>
+        </w:rPr>
+        <w:t>/Will</w:t>
+      </w:r>
+      <w:r>
+        <w:rPr>
+          <w:sz w:val="28"/>
+          <w:szCs w:val="28"/>
+        </w:rPr>
+        <w:t xml:space="preserve"> reference]. RNA extraction and next-generation sequencing were performed using the </w:t>
+      </w:r>
+      <w:proofErr w:type="spellStart"/>
+      <w:r>
+        <w:rPr>
+          <w:sz w:val="28"/>
+          <w:szCs w:val="28"/>
+        </w:rPr>
+        <w:t>miND</w:t>
+      </w:r>
+      <w:proofErr w:type="spellEnd"/>
+      <w:r>
+        <w:rPr>
+          <w:sz w:val="28"/>
+          <w:szCs w:val="28"/>
+        </w:rPr>
+        <w:t>®</w:t>
+      </w:r>
+      <w:r>
+        <w:rPr>
+          <w:sz w:val="28"/>
+          <w:szCs w:val="28"/>
+        </w:rPr>
+        <w:t xml:space="preserve"> analysis pipeline [mind reference].</w:t>
+      </w:r>
+    </w:p>
+    <w:p>
+      <w:pPr>
+        <w:rPr>
+          <w:sz w:val="28"/>
+          <w:szCs w:val="28"/>
+        </w:rPr>
+      </w:pPr>
+    </w:p>
+    <w:p>
+      <w:pPr>
+        <w:rPr>
+          <w:sz w:val="28"/>
+          <w:szCs w:val="28"/>
+        </w:rPr>
+      </w:pPr>
+    </w:p>
+    <w:p>
+      <w:pPr>
+        <w:rPr>
+          <w:sz w:val="28"/>
+          <w:szCs w:val="28"/>
+        </w:rPr>
+      </w:pPr>
     </w:p>
     <w:p>
       <w:pPr>
@@ -517,6 +611,13 @@
         </w:rPr>
         <w:t>Mapping</w:t>
       </w:r>
+      <w:r>
+        <w:rPr>
+          <w:sz w:val="28"/>
+          <w:szCs w:val="28"/>
+        </w:rPr>
+        <w:t xml:space="preserve"> </w:t>
+      </w:r>
     </w:p>
     <w:p>
       <w:pPr>
@@ -582,6 +683,53 @@
       </w:pPr>
       <w:r>
         <w:t>1 mismatch?</w:t>
+      </w:r>
+    </w:p>
+    <w:p>
+      <w:pPr>
+        <w:rPr>
+          <w:b/>
+          <w:bCs/>
+        </w:rPr>
+      </w:pPr>
+      <w:r>
+        <w:rPr>
+          <w:b/>
+          <w:bCs/>
+        </w:rPr>
+        <w:t>References</w:t>
+      </w:r>
+    </w:p>
+    <w:p>
+      <w:pPr>
+        <w:pStyle w:val="ListParagraph"/>
+        <w:numPr>
+          <w:ilvl w:val="0"/>
+          <w:numId w:val="2"/>
+        </w:numPr>
+        <w:rPr>
+          <w:sz w:val="28"/>
+          <w:szCs w:val="28"/>
+        </w:rPr>
+      </w:pPr>
+      <w:r>
+        <w:t>Mature miRNAs miRbase 22.1</w:t>
+      </w:r>
+    </w:p>
+    <w:p>
+      <w:pPr>
+        <w:pStyle w:val="ListParagraph"/>
+        <w:numPr>
+          <w:ilvl w:val="0"/>
+          <w:numId w:val="2"/>
+        </w:numPr>
+        <w:rPr>
+          <w:sz w:val="28"/>
+          <w:szCs w:val="28"/>
+        </w:rPr>
+      </w:pPr>
+      <w:r>
+        <w:t>Hairpin miRNAs miRbase 22.1</w:t>
       </w:r>
     </w:p>
     <w:p/>
@@ -791,7 +939,6 @@
         </w:numPr>
       </w:pPr>
       <w:r>
-        <w:lastRenderedPageBreak/>
         <w:t>Negative binomial dispersion by weighted likelihood empirical Bayes (</w:t>
       </w:r>
       <w:proofErr w:type="spellStart"/>
@@ -848,27 +995,35 @@
         </w:numPr>
       </w:pPr>
       <w:r>
-        <w:t>Significance = FDR &lt; 0.05 and |</w:t>
+        <w:t xml:space="preserve">Significance = FDR &lt; 0.05 </w:t>
+      </w:r>
+      <w:r>
+        <w:t xml:space="preserve">for protease, 0.2 for </w:t>
       </w:r>
       <w:proofErr w:type="spellStart"/>
       <w:r>
+        <w:t>HDM_Dog</w:t>
+      </w:r>
+      <w:proofErr w:type="spellEnd"/>
+    </w:p>
+    <w:p>
+      <w:pPr>
+        <w:pStyle w:val="ListParagraph"/>
+        <w:numPr>
+          <w:ilvl w:val="0"/>
+          <w:numId w:val="8"/>
+        </w:numPr>
+      </w:pPr>
+      <w:r>
+        <w:t>|</w:t>
+      </w:r>
+      <w:proofErr w:type="spellStart"/>
+      <w:r>
         <w:t>logFC</w:t>
       </w:r>
       <w:proofErr w:type="spellEnd"/>
       <w:r>
-        <w:t>| &gt;1</w:t>
-      </w:r>
-    </w:p>
-    <w:p>
-      <w:pPr>
-        <w:pStyle w:val="ListParagraph"/>
-        <w:numPr>
-          <w:ilvl w:val="2"/>
-          <w:numId w:val="8"/>
-        </w:numPr>
-      </w:pPr>
-      <w:r>
-        <w:t>Note: Significance might have to be increased for HDM/Dog</w:t>
+        <w:t>| &gt;1 for ORA (but not GSEA)</w:t>
       </w:r>
     </w:p>
     <w:p/>
@@ -963,6 +1118,9 @@
       <w:r>
         <w:t xml:space="preserve"> 0.05</w:t>
       </w:r>
+      <w:r>
+        <w:t xml:space="preserve"> </w:t>
+      </w:r>
     </w:p>
     <w:p>
       <w:pPr>
@@ -997,6 +1155,7 @@
         </w:numPr>
       </w:pPr>
       <w:r>
+        <w:lastRenderedPageBreak/>
         <w:t>Removing target genes supported by weak experimental evidence did not substantially reduce the target gene set</w:t>
       </w:r>
       <w:r>
@@ -1083,6 +1242,34 @@
     <w:p>
       <w:pPr>
         <w:pStyle w:val="ListParagraph"/>
+        <w:numPr>
+          <w:ilvl w:val="0"/>
+          <w:numId w:val="8"/>
+        </w:numPr>
+      </w:pPr>
+      <w:proofErr w:type="spellStart"/>
+      <w:r>
+        <w:t>Nte</w:t>
+      </w:r>
+      <w:proofErr w:type="spellEnd"/>
+      <w:r>
+        <w:t xml:space="preserve">: need to make sure this is in the script: </w:t>
+      </w:r>
+      <w:r>
+        <w:t>|</w:t>
+      </w:r>
+      <w:proofErr w:type="spellStart"/>
+      <w:r>
+        <w:t>logFC</w:t>
+      </w:r>
+      <w:proofErr w:type="spellEnd"/>
+      <w:r>
+        <w:t>| &gt;1 for ORA (but not GSEA)</w:t>
+      </w:r>
+    </w:p>
+    <w:p>
+      <w:pPr>
+        <w:pStyle w:val="ListParagraph"/>
         <w:ind w:left="1440"/>
       </w:pPr>
     </w:p>
@@ -1092,6 +1279,12 @@
         <w:ind w:left="1440"/>
       </w:pPr>
     </w:p>
+    <w:p>
+      <w:pPr>
+        <w:pStyle w:val="ListParagraph"/>
+        <w:ind w:left="1440"/>
+      </w:pPr>
+    </w:p>
     <w:p/>
     <w:p>
       <w:pPr>
@@ -1229,7 +1422,6 @@
         </w:numPr>
       </w:pPr>
       <w:r>
-        <w:lastRenderedPageBreak/>
         <w:t>Qiagen IPA</w:t>
       </w:r>
     </w:p>
@@ -1272,6 +1464,123 @@
         <w:t>[filters to reduce target genes]</w:t>
       </w:r>
     </w:p>
+    <w:p/>
+    <w:p>
+      <w:pPr>
+        <w:pStyle w:val="ListParagraph"/>
+        <w:numPr>
+          <w:ilvl w:val="0"/>
+          <w:numId w:val="3"/>
+        </w:numPr>
+        <w:rPr>
+          <w:sz w:val="28"/>
+          <w:szCs w:val="28"/>
+        </w:rPr>
+      </w:pPr>
+      <w:r>
+        <w:rPr>
+          <w:sz w:val="28"/>
+          <w:szCs w:val="28"/>
+        </w:rPr>
+        <w:t>Previous Work</w:t>
+      </w:r>
+    </w:p>
+    <w:p>
+      <w:r>
+        <w:t xml:space="preserve">DE analysis was previously performed for all allergen exposures by </w:t>
+      </w:r>
+      <w:proofErr w:type="spellStart"/>
+      <w:r>
+        <w:t>TamiRNA</w:t>
+      </w:r>
+      <w:proofErr w:type="spellEnd"/>
+      <w:r>
+        <w:t xml:space="preserve"> using the </w:t>
+      </w:r>
+      <w:proofErr w:type="spellStart"/>
+      <w:r>
+        <w:t>miND</w:t>
+      </w:r>
+      <w:proofErr w:type="spellEnd"/>
+      <w:r>
+        <w:rPr>
+          <w:sz w:val="28"/>
+          <w:szCs w:val="28"/>
+        </w:rPr>
+        <w:t>®</w:t>
+      </w:r>
+      <w:r>
+        <w:t xml:space="preserve"> pipeline [reference], and pathway analysis performed by [Prof. Vicky] for protease exposure, as </w:t>
+      </w:r>
+      <w:r>
+        <w:t>described</w:t>
+      </w:r>
+      <w:r>
+        <w:t xml:space="preserve"> in [GH reference]. Pathway analysis </w:t>
+      </w:r>
+      <w:r>
+        <w:t>of</w:t>
+      </w:r>
+      <w:r>
+        <w:t xml:space="preserve"> HDM and dog exposure </w:t>
+      </w:r>
+      <w:r>
+        <w:t>was</w:t>
+      </w:r>
+      <w:r>
+        <w:t xml:space="preserve"> novel. These methods describe an independent analysis pipeline executed</w:t>
+      </w:r>
+      <w:r>
+        <w:t xml:space="preserve"> prior to results from any previous work being disclosed.</w:t>
+      </w:r>
+    </w:p>
+    <w:p/>
+    <w:p>
+      <w:pPr>
+        <w:pStyle w:val="ListParagraph"/>
+        <w:numPr>
+          <w:ilvl w:val="0"/>
+          <w:numId w:val="3"/>
+        </w:numPr>
+        <w:rPr>
+          <w:sz w:val="28"/>
+          <w:szCs w:val="28"/>
+        </w:rPr>
+      </w:pPr>
+      <w:r>
+        <w:rPr>
+          <w:sz w:val="28"/>
+          <w:szCs w:val="28"/>
+        </w:rPr>
+        <w:t>Code availability</w:t>
+      </w:r>
+    </w:p>
+    <w:p>
+      <w:r>
+        <w:t>All code used in this study is available at [</w:t>
+      </w:r>
+      <w:proofErr w:type="spellStart"/>
+      <w:r>
+        <w:t>github</w:t>
+      </w:r>
+      <w:proofErr w:type="spellEnd"/>
+      <w:r>
+        <w:t xml:space="preserve">]. </w:t>
+      </w:r>
+      <w:r>
+        <w:t>Bash scripts (.</w:t>
+      </w:r>
+      <w:proofErr w:type="spellStart"/>
+      <w:r>
+        <w:t>sh</w:t>
+      </w:r>
+      <w:proofErr w:type="spellEnd"/>
+      <w:r>
+        <w:t>) were generated from a manually produced template script, designed to standardise structure, and log and error handling.</w:t>
+      </w:r>
+    </w:p>
+    <w:p/>
+    <w:p/>
     <w:p/>
     <w:sectPr>
       <w:pgSz w:w="11906" w:h="16838"/>
@@ -1488,6 +1797,95 @@
     </w:lvl>
   </w:abstractNum>
   <w:abstractNum w:abstractNumId="2" w15:restartNumberingAfterBreak="0">
+    <w:nsid w:val="134023D7"/>
+    <w:multiLevelType w:val="hybridMultilevel"/>
+    <w:tmpl w:val="5172EBE4"/>
+    <w:lvl w:ilvl="0" w:tplc="FFFFFFFF">
+      <w:start w:val="1"/>
+      <w:numFmt w:val="decimal"/>
+      <w:lvlText w:val="%1."/>
+      <w:lvlJc w:val="left"/>
+      <w:pPr>
+        <w:ind w:left="360" w:hanging="360"/>
+      </w:pPr>
+      <w:rPr>
+        <w:rFonts w:hint="default"/>
+      </w:rPr>
+    </w:lvl>
+    <w:lvl w:ilvl="1" w:tplc="FFFFFFFF">
+      <w:start w:val="1"/>
+      <w:numFmt w:val="lowerLetter"/>
+      <w:lvlText w:val="%2."/>
+      <w:lvlJc w:val="left"/>
+      <w:pPr>
+        <w:ind w:left="1080" w:hanging="360"/>
+      </w:pPr>
+    </w:lvl>
+    <w:lvl w:ilvl="2" w:tplc="FFFFFFFF" w:tentative="1">
+      <w:start w:val="1"/>
+      <w:numFmt w:val="lowerRoman"/>
+      <w:lvlText w:val="%3."/>
+      <w:lvlJc w:val="right"/>
+      <w:pPr>
+        <w:ind w:left="1800" w:hanging="180"/>
+      </w:pPr>
+    </w:lvl>
+    <w:lvl w:ilvl="3" w:tplc="FFFFFFFF" w:tentative="1">
+      <w:start w:val="1"/>
+      <w:numFmt w:val="decimal"/>
+      <w:lvlText w:val="%4."/>
+      <w:lvlJc w:val="left"/>
+      <w:pPr>
+        <w:ind w:left="2520" w:hanging="360"/>
+      </w:pPr>
+    </w:lvl>
+    <w:lvl w:ilvl="4" w:tplc="FFFFFFFF" w:tentative="1">
+      <w:start w:val="1"/>
+      <w:numFmt w:val="lowerLetter"/>
+      <w:lvlText w:val="%5."/>
+      <w:lvlJc w:val="left"/>
+      <w:pPr>
+        <w:ind w:left="3240" w:hanging="360"/>
+      </w:pPr>
+    </w:lvl>
+    <w:lvl w:ilvl="5" w:tplc="FFFFFFFF" w:tentative="1">
+      <w:start w:val="1"/>
+      <w:numFmt w:val="lowerRoman"/>
+      <w:lvlText w:val="%6."/>
+      <w:lvlJc w:val="right"/>
+      <w:pPr>
+        <w:ind w:left="3960" w:hanging="180"/>
+      </w:pPr>
+    </w:lvl>
+    <w:lvl w:ilvl="6" w:tplc="FFFFFFFF" w:tentative="1">
+      <w:start w:val="1"/>
+      <w:numFmt w:val="decimal"/>
+      <w:lvlText w:val="%7."/>
+      <w:lvlJc w:val="left"/>
+      <w:pPr>
+        <w:ind w:left="4680" w:hanging="360"/>
+      </w:pPr>
+    </w:lvl>
+    <w:lvl w:ilvl="7" w:tplc="FFFFFFFF" w:tentative="1">
+      <w:start w:val="1"/>
+      <w:numFmt w:val="lowerLetter"/>
+      <w:lvlText w:val="%8."/>
+      <w:lvlJc w:val="left"/>
+      <w:pPr>
+        <w:ind w:left="5400" w:hanging="360"/>
+      </w:pPr>
+    </w:lvl>
+    <w:lvl w:ilvl="8" w:tplc="FFFFFFFF" w:tentative="1">
+      <w:start w:val="1"/>
+      <w:numFmt w:val="lowerRoman"/>
+      <w:lvlText w:val="%9."/>
+      <w:lvlJc w:val="right"/>
+      <w:pPr>
+        <w:ind w:left="6120" w:hanging="180"/>
+      </w:pPr>
+    </w:lvl>
+  </w:abstractNum>
+  <w:abstractNum w:abstractNumId="3" w15:restartNumberingAfterBreak="0">
     <w:nsid w:val="20325259"/>
     <w:multiLevelType w:val="hybridMultilevel"/>
     <w:tmpl w:val="37B6D260"/>
@@ -1573,7 +1971,7 @@
       </w:pPr>
     </w:lvl>
   </w:abstractNum>
-  <w:abstractNum w:abstractNumId="3" w15:restartNumberingAfterBreak="0">
+  <w:abstractNum w:abstractNumId="4" w15:restartNumberingAfterBreak="0">
     <w:nsid w:val="35E83D9A"/>
     <w:multiLevelType w:val="hybridMultilevel"/>
     <w:tmpl w:val="37B6D260"/>
@@ -1659,7 +2057,7 @@
       </w:pPr>
     </w:lvl>
   </w:abstractNum>
-  <w:abstractNum w:abstractNumId="4" w15:restartNumberingAfterBreak="0">
+  <w:abstractNum w:abstractNumId="5" w15:restartNumberingAfterBreak="0">
     <w:nsid w:val="49724D68"/>
     <w:multiLevelType w:val="hybridMultilevel"/>
     <w:tmpl w:val="37B6D260"/>
@@ -1745,7 +2143,7 @@
       </w:pPr>
     </w:lvl>
   </w:abstractNum>
-  <w:abstractNum w:abstractNumId="5" w15:restartNumberingAfterBreak="0">
+  <w:abstractNum w:abstractNumId="6" w15:restartNumberingAfterBreak="0">
     <w:nsid w:val="55932E42"/>
     <w:multiLevelType w:val="hybridMultilevel"/>
     <w:tmpl w:val="37B6D260"/>
@@ -1831,7 +2229,7 @@
       </w:pPr>
     </w:lvl>
   </w:abstractNum>
-  <w:abstractNum w:abstractNumId="6" w15:restartNumberingAfterBreak="0">
+  <w:abstractNum w:abstractNumId="7" w15:restartNumberingAfterBreak="0">
     <w:nsid w:val="5DDB6516"/>
     <w:multiLevelType w:val="hybridMultilevel"/>
     <w:tmpl w:val="BAFE4C50"/>
@@ -1944,7 +2342,7 @@
       </w:rPr>
     </w:lvl>
   </w:abstractNum>
-  <w:abstractNum w:abstractNumId="7" w15:restartNumberingAfterBreak="0">
+  <w:abstractNum w:abstractNumId="8" w15:restartNumberingAfterBreak="0">
     <w:nsid w:val="735A138F"/>
     <w:multiLevelType w:val="hybridMultilevel"/>
     <w:tmpl w:val="37B6D260"/>
@@ -2030,7 +2428,7 @@
       </w:pPr>
     </w:lvl>
   </w:abstractNum>
-  <w:abstractNum w:abstractNumId="8" w15:restartNumberingAfterBreak="0">
+  <w:abstractNum w:abstractNumId="9" w15:restartNumberingAfterBreak="0">
     <w:nsid w:val="746A5C0A"/>
     <w:multiLevelType w:val="hybridMultilevel"/>
     <w:tmpl w:val="50DEA51A"/>
@@ -2143,7 +2541,7 @@
       </w:rPr>
     </w:lvl>
   </w:abstractNum>
-  <w:abstractNum w:abstractNumId="9" w15:restartNumberingAfterBreak="0">
+  <w:abstractNum w:abstractNumId="10" w15:restartNumberingAfterBreak="0">
     <w:nsid w:val="76735E75"/>
     <w:multiLevelType w:val="hybridMultilevel"/>
     <w:tmpl w:val="37B6D260"/>
@@ -2229,7 +2627,7 @@
       </w:pPr>
     </w:lvl>
   </w:abstractNum>
-  <w:abstractNum w:abstractNumId="10" w15:restartNumberingAfterBreak="0">
+  <w:abstractNum w:abstractNumId="11" w15:restartNumberingAfterBreak="0">
     <w:nsid w:val="7F5B282A"/>
     <w:multiLevelType w:val="hybridMultilevel"/>
     <w:tmpl w:val="37B6D260"/>
@@ -2316,10 +2714,10 @@
     </w:lvl>
   </w:abstractNum>
   <w:num w:numId="1" w16cid:durableId="853226515">
-    <w:abstractNumId w:val="8"/>
+    <w:abstractNumId w:val="9"/>
   </w:num>
   <w:num w:numId="2" w16cid:durableId="1337922806">
-    <w:abstractNumId w:val="6"/>
+    <w:abstractNumId w:val="7"/>
   </w:num>
   <w:num w:numId="3" w16cid:durableId="883753567">
     <w:abstractNumId w:val="0"/>
@@ -2328,25 +2726,28 @@
     <w:abstractNumId w:val="1"/>
   </w:num>
   <w:num w:numId="5" w16cid:durableId="556012627">
+    <w:abstractNumId w:val="6"/>
+  </w:num>
+  <w:num w:numId="6" w16cid:durableId="86736185">
+    <w:abstractNumId w:val="4"/>
+  </w:num>
+  <w:num w:numId="7" w16cid:durableId="2018539843">
+    <w:abstractNumId w:val="8"/>
+  </w:num>
+  <w:num w:numId="8" w16cid:durableId="1884248195">
+    <w:abstractNumId w:val="3"/>
+  </w:num>
+  <w:num w:numId="9" w16cid:durableId="2054689356">
+    <w:abstractNumId w:val="11"/>
+  </w:num>
+  <w:num w:numId="10" w16cid:durableId="79260297">
+    <w:abstractNumId w:val="10"/>
+  </w:num>
+  <w:num w:numId="11" w16cid:durableId="1727559935">
     <w:abstractNumId w:val="5"/>
   </w:num>
-  <w:num w:numId="6" w16cid:durableId="86736185">
-    <w:abstractNumId w:val="3"/>
-  </w:num>
-  <w:num w:numId="7" w16cid:durableId="2018539843">
-    <w:abstractNumId w:val="7"/>
-  </w:num>
-  <w:num w:numId="8" w16cid:durableId="1884248195">
+  <w:num w:numId="12" w16cid:durableId="613823888">
     <w:abstractNumId w:val="2"/>
-  </w:num>
-  <w:num w:numId="9" w16cid:durableId="2054689356">
-    <w:abstractNumId w:val="10"/>
-  </w:num>
-  <w:num w:numId="10" w16cid:durableId="79260297">
-    <w:abstractNumId w:val="9"/>
-  </w:num>
-  <w:num w:numId="11" w16cid:durableId="1727559935">
-    <w:abstractNumId w:val="4"/>
   </w:num>
 </w:numbering>
 </file>

</xml_diff>